<commit_message>
added tianshifang and emofang
</commit_message>
<xml_diff>
--- a/新的想法.docx
+++ b/新的想法.docx
@@ -28,11 +28,6 @@
     <w:p/>
     <w:p/>
     <w:p>
-      <w:pPr>
-        <w:rPr>
-          <w:rFonts w:hint="eastAsia"/>
-        </w:rPr>
-      </w:pPr>
       <w:r>
         <w:rPr>
           <w:rFonts w:hint="eastAsia"/>
@@ -97,11 +92,6 @@
     </w:p>
     <w:p/>
     <w:p>
-      <w:pPr>
-        <w:rPr>
-          <w:rFonts w:hint="eastAsia"/>
-        </w:rPr>
-      </w:pPr>
       <w:r>
         <w:rPr>
           <w:rFonts w:hint="eastAsia"/>
@@ -110,11 +100,6 @@
       </w:r>
     </w:p>
     <w:p>
-      <w:pPr>
-        <w:rPr>
-          <w:rFonts w:hint="eastAsia"/>
-        </w:rPr>
-      </w:pPr>
       <w:r>
         <w:rPr>
           <w:rFonts w:hint="eastAsia"/>
@@ -210,13 +195,7 @@
         <w:t xml:space="preserve"> </w:t>
       </w:r>
     </w:p>
-    <w:p>
-      <w:pPr>
-        <w:rPr>
-          <w:rFonts w:hint="eastAsia"/>
-        </w:rPr>
-      </w:pPr>
-    </w:p>
+    <w:p/>
     <w:p/>
     <w:p>
       <w:r>
@@ -411,13 +390,7 @@
         <w:rPr>
           <w:rFonts w:hint="eastAsia"/>
         </w:rPr>
-        <w:t>关卡开始后</w:t>
-      </w:r>
-      <w:r>
-        <w:rPr>
-          <w:rFonts w:hint="eastAsia"/>
-        </w:rPr>
-        <w:t>一次性刷出来</w:t>
+        <w:t>关卡开始后一次性刷出来</w:t>
       </w:r>
       <w:r>
         <w:t>5</w:t>
@@ -426,13 +399,7 @@
         <w:rPr>
           <w:rFonts w:hint="eastAsia"/>
         </w:rPr>
-        <w:t>棵树</w:t>
-      </w:r>
-      <w:r>
-        <w:rPr>
-          <w:rFonts w:hint="eastAsia"/>
-        </w:rPr>
-        <w:t>，所有树都被砍掉后再次刷出5棵新树 以此往复。</w:t>
+        <w:t>棵树，所有树都被砍掉后再次刷出5棵新树 以此往复。</w:t>
       </w:r>
     </w:p>
     <w:p>
@@ -450,19 +417,7 @@
         <w:rPr>
           <w:rFonts w:hint="eastAsia"/>
         </w:rPr>
-        <w:t>根据树的血量百分比获得木材，以下是分别砍到</w:t>
-      </w:r>
-      <w:r>
-        <w:rPr>
-          <w:rFonts w:hint="eastAsia"/>
-        </w:rPr>
-        <w:t>不茂密的树-树干-消失</w:t>
-      </w:r>
-      <w:r>
-        <w:rPr>
-          <w:rFonts w:hint="eastAsia"/>
-        </w:rPr>
-        <w:t>这三个阶段时获得的木材：5</w:t>
+        <w:t>根据树的血量百分比获得木材，以下是分别砍到不茂密的树-树干-消失这三个阶段时获得的木材：5</w:t>
       </w:r>
       <w:r>
         <w:t>-10-20</w:t>
@@ -484,9 +439,6 @@
       <w:pPr>
         <w:pStyle w:val="a7"/>
         <w:ind w:left="360" w:firstLineChars="0" w:firstLine="0"/>
-        <w:rPr>
-          <w:rFonts w:hint="eastAsia"/>
-        </w:rPr>
       </w:pPr>
       <w:r>
         <w:rPr>
@@ -499,9 +451,6 @@
       <w:pPr>
         <w:pStyle w:val="a7"/>
         <w:ind w:left="360" w:firstLineChars="0" w:firstLine="0"/>
-        <w:rPr>
-          <w:rFonts w:hint="eastAsia"/>
-        </w:rPr>
       </w:pPr>
     </w:p>
     <w:p>
@@ -571,9 +520,6 @@
       <w:pPr>
         <w:pStyle w:val="a7"/>
         <w:ind w:left="360" w:firstLineChars="0" w:firstLine="0"/>
-        <w:rPr>
-          <w:rFonts w:hint="eastAsia"/>
-        </w:rPr>
       </w:pPr>
       <w:r>
         <w:rPr>
@@ -772,7 +718,7 @@
         <w:ind w:left="360" w:firstLineChars="0" w:firstLine="0"/>
         <w:rPr>
           <w:rStyle w:val="a8"/>
-          <w:rFonts w:ascii="Arial" w:hAnsi="Arial" w:cs="Arial" w:hint="eastAsia"/>
+          <w:rFonts w:ascii="Arial" w:hAnsi="Arial" w:cs="Arial"/>
         </w:rPr>
       </w:pPr>
       <w:r>
@@ -1071,7 +1017,7 @@
         <w:ind w:left="360" w:firstLineChars="0" w:firstLine="0"/>
         <w:rPr>
           <w:rStyle w:val="a8"/>
-          <w:rFonts w:ascii="Arial" w:hAnsi="Arial" w:cs="Arial" w:hint="eastAsia"/>
+          <w:rFonts w:ascii="Arial" w:hAnsi="Arial" w:cs="Arial"/>
         </w:rPr>
       </w:pPr>
       <w:r>
@@ -1132,7 +1078,7 @@
         <w:ind w:left="360" w:firstLineChars="0" w:firstLine="0"/>
         <w:rPr>
           <w:rStyle w:val="a8"/>
-          <w:rFonts w:ascii="Arial" w:hAnsi="Arial" w:cs="Arial" w:hint="eastAsia"/>
+          <w:rFonts w:ascii="Arial" w:hAnsi="Arial" w:cs="Arial"/>
         </w:rPr>
       </w:pPr>
     </w:p>
@@ -1233,37 +1179,20 @@
     <w:p/>
     <w:p/>
     <w:p>
-      <w:pPr>
-        <w:rPr>
-          <w:rFonts w:hint="eastAsia"/>
-        </w:rPr>
-      </w:pPr>
-      <w:r>
-        <w:rPr>
-          <w:rFonts w:hint="eastAsia"/>
-        </w:rPr>
-        <w:t>我希望在进入下一关的时候有一个场景切换效果。完成关卡后表现为玩家</w:t>
-      </w:r>
-      <w:r>
-        <w:rPr>
-          <w:rFonts w:hint="eastAsia"/>
-        </w:rPr>
-        <w:t>向屏幕上方</w:t>
-      </w:r>
-      <w:r>
-        <w:rPr>
-          <w:rFonts w:hint="eastAsia"/>
-        </w:rPr>
-        <w:t>跳起来 跳到下一个场景中间  场景的视觉切换为竖着滚轴似的 随着玩家跳跃场景也滚动到下一个场景 滚动完成和玩家跳跃完毕为一个时间点</w:t>
-      </w:r>
-    </w:p>
-    <w:p>
-      <w:pPr>
-        <w:rPr>
-          <w:rFonts w:hint="eastAsia"/>
-        </w:rPr>
-      </w:pPr>
-    </w:p>
+      <w:r>
+        <w:rPr>
+          <w:rFonts w:hint="eastAsia"/>
+        </w:rPr>
+        <w:t>我希望在进入下一关的时候有一个场景切换效果。完成关卡后表现为玩家向屏幕上方跳起来 跳到下一个场景中间  场景的视觉切换为竖着滚轴似的 随着玩家跳跃场景也滚动到下一个场景 滚动完成和玩家跳跃完毕为一个时间点</w:t>
+      </w:r>
+      <w:r>
+        <w:rPr>
+          <w:rFonts w:hint="eastAsia"/>
+        </w:rPr>
+        <w:t xml:space="preserve"> </w:t>
+      </w:r>
+    </w:p>
+    <w:p/>
     <w:p>
       <w:r>
         <w:rPr>
@@ -1272,21 +1201,388 @@
         <w:t>下一关场景切换：</w:t>
       </w:r>
     </w:p>
-    <w:p>
-      <w:r>
-        <w:rPr>
-          <w:rFonts w:hint="eastAsia"/>
-        </w:rPr>
-        <w:t>石头遮挡</w:t>
-      </w:r>
-    </w:p>
-    <w:p>
-      <w:r>
-        <w:rPr>
-          <w:rFonts w:hint="eastAsia"/>
-        </w:rPr>
-        <w:t>水减速 减气：</w:t>
-      </w:r>
+    <w:p/>
+    <w:p>
+      <w:pPr>
+        <w:rPr>
+          <w:rFonts w:hint="eastAsia"/>
+        </w:rPr>
+      </w:pPr>
+      <w:r>
+        <w:rPr>
+          <w:rFonts w:hint="eastAsia"/>
+        </w:rPr>
+        <w:t>地面元素</w:t>
+      </w:r>
+    </w:p>
+    <w:p>
+      <w:r>
+        <w:rPr>
+          <w:rFonts w:hint="eastAsia"/>
+        </w:rPr>
+        <w:t>石头</w:t>
+      </w:r>
+      <w:r>
+        <w:rPr>
+          <w:rFonts w:hint="eastAsia"/>
+        </w:rPr>
+        <w:t>：</w:t>
+      </w:r>
+      <w:r>
+        <w:rPr>
+          <w:rFonts w:hint="eastAsia"/>
+        </w:rPr>
+        <w:t>遮挡</w:t>
+      </w:r>
+    </w:p>
+    <w:p>
+      <w:r>
+        <w:rPr>
+          <w:rFonts w:hint="eastAsia"/>
+        </w:rPr>
+        <w:t>宝箱：</w:t>
+      </w:r>
+    </w:p>
+    <w:p/>
+    <w:p>
+      <w:r>
+        <w:rPr>
+          <w:rFonts w:hint="eastAsia"/>
+        </w:rPr>
+        <w:t>恶魔奖励 天使奖励</w:t>
+      </w:r>
+    </w:p>
+    <w:p>
+      <w:pPr>
+        <w:rPr>
+          <w:rFonts w:hint="eastAsia"/>
+        </w:rPr>
+      </w:pPr>
+    </w:p>
+    <w:p>
+      <w:pPr>
+        <w:rPr>
+          <w:rFonts w:hint="eastAsia"/>
+        </w:rPr>
+      </w:pPr>
+      <w:proofErr w:type="gramStart"/>
+      <w:r>
+        <w:rPr>
+          <w:rFonts w:hint="eastAsia"/>
+        </w:rPr>
+        <w:t>恶魔房</w:t>
+      </w:r>
+      <w:proofErr w:type="gramEnd"/>
+      <w:r>
+        <w:rPr>
+          <w:rFonts w:hint="eastAsia"/>
+        </w:rPr>
+        <w:t xml:space="preserve"> 天使房</w:t>
+      </w:r>
+    </w:p>
+    <w:p>
+      <w:r>
+        <w:t>B</w:t>
+      </w:r>
+      <w:r>
+        <w:rPr>
+          <w:rFonts w:hint="eastAsia"/>
+        </w:rPr>
+        <w:t>oss</w:t>
+      </w:r>
+      <w:r>
+        <w:rPr>
+          <w:rFonts w:hint="eastAsia"/>
+        </w:rPr>
+        <w:t>关</w:t>
+      </w:r>
+      <w:r>
+        <w:t xml:space="preserve"> </w:t>
+      </w:r>
+      <w:r>
+        <w:rPr>
+          <w:rFonts w:hint="eastAsia"/>
+        </w:rPr>
+        <w:t>场景</w:t>
+      </w:r>
+    </w:p>
+    <w:p>
+      <w:pPr>
+        <w:rPr>
+          <w:rFonts w:hint="eastAsia"/>
+        </w:rPr>
+      </w:pPr>
+    </w:p>
+    <w:p>
+      <w:pPr>
+        <w:rPr>
+          <w:rFonts w:hint="eastAsia"/>
+        </w:rPr>
+      </w:pPr>
+    </w:p>
+    <w:p>
+      <w:r>
+        <w:rPr>
+          <w:rFonts w:hint="eastAsia"/>
+        </w:rPr>
+        <w:t>水</w:t>
+      </w:r>
+      <w:r>
+        <w:rPr>
+          <w:rFonts w:hint="eastAsia"/>
+        </w:rPr>
+        <w:t>地块</w:t>
+      </w:r>
+    </w:p>
+    <w:p>
+      <w:r>
+        <w:rPr>
+          <w:rFonts w:hint="eastAsia"/>
+        </w:rPr>
+        <w:t>效果：</w:t>
+      </w:r>
+      <w:r>
+        <w:rPr>
+          <w:rFonts w:hint="eastAsia"/>
+        </w:rPr>
+        <w:t>单位路过：</w:t>
+      </w:r>
+      <w:r>
+        <w:rPr>
+          <w:rFonts w:hint="eastAsia"/>
+        </w:rPr>
+        <w:t>减速</w:t>
+      </w:r>
+      <w:r>
+        <w:rPr>
+          <w:rFonts w:hint="eastAsia"/>
+        </w:rPr>
+        <w:t xml:space="preserve"> 单位路过时要有减速颜色效果，可以</w:t>
+      </w:r>
+      <w:proofErr w:type="gramStart"/>
+      <w:r>
+        <w:rPr>
+          <w:rFonts w:hint="eastAsia"/>
+        </w:rPr>
+        <w:t>用冰伤效果</w:t>
+      </w:r>
+      <w:proofErr w:type="gramEnd"/>
+      <w:r>
+        <w:rPr>
+          <w:rFonts w:hint="eastAsia"/>
+        </w:rPr>
+        <w:t>的变蓝。</w:t>
+      </w:r>
+      <w:r>
+        <w:rPr>
+          <w:rFonts w:hint="eastAsia"/>
+        </w:rPr>
+        <w:t xml:space="preserve"> </w:t>
+      </w:r>
+    </w:p>
+    <w:p>
+      <w:r>
+        <w:rPr>
+          <w:rFonts w:hint="eastAsia"/>
+        </w:rPr>
+        <w:t>画线路过：</w:t>
+      </w:r>
+      <w:proofErr w:type="gramStart"/>
+      <w:r>
+        <w:rPr>
+          <w:rFonts w:hint="eastAsia"/>
+        </w:rPr>
+        <w:t>减气</w:t>
+      </w:r>
+      <w:proofErr w:type="gramEnd"/>
+      <w:r>
+        <w:rPr>
+          <w:rFonts w:hint="eastAsia"/>
+        </w:rPr>
+        <w:t xml:space="preserve">  画线模式下水地块不要暗色遮罩 就像小</w:t>
+      </w:r>
+      <w:proofErr w:type="gramStart"/>
+      <w:r>
+        <w:rPr>
+          <w:rFonts w:hint="eastAsia"/>
+        </w:rPr>
+        <w:t>怪一样</w:t>
+      </w:r>
+      <w:proofErr w:type="gramEnd"/>
+      <w:r>
+        <w:rPr>
+          <w:rFonts w:hint="eastAsia"/>
+        </w:rPr>
+        <w:t>保持原来的色彩。</w:t>
+      </w:r>
+    </w:p>
+    <w:p>
+      <w:pPr>
+        <w:rPr>
+          <w:rFonts w:hint="eastAsia"/>
+        </w:rPr>
+      </w:pPr>
+      <w:r>
+        <w:rPr>
+          <w:rFonts w:hint="eastAsia"/>
+        </w:rPr>
+        <w:t>水地块生成逻辑：会在第一关之后的关卡里（不包含第一关）随机生成，</w:t>
+      </w:r>
+      <w:r>
+        <w:rPr>
+          <w:rFonts w:hint="eastAsia"/>
+        </w:rPr>
+        <w:t xml:space="preserve">水地块组合一般是两种形态：河流形态 一般是条状 </w:t>
+      </w:r>
+      <w:r>
+        <w:t xml:space="preserve"> </w:t>
+      </w:r>
+      <w:r>
+        <w:rPr>
+          <w:rFonts w:hint="eastAsia"/>
+        </w:rPr>
+        <w:t>水池形态 一般是方块状。</w:t>
+      </w:r>
+      <w:r>
+        <w:rPr>
+          <w:rFonts w:hint="eastAsia"/>
+        </w:rPr>
+        <w:t>一</w:t>
+      </w:r>
+      <w:r>
+        <w:rPr>
+          <w:rFonts w:hint="eastAsia"/>
+        </w:rPr>
+        <w:t>个河流组合</w:t>
+      </w:r>
+      <w:r>
+        <w:rPr>
+          <w:rFonts w:hint="eastAsia"/>
+        </w:rPr>
+        <w:t>大小</w:t>
+      </w:r>
+      <w:r>
+        <w:rPr>
+          <w:rFonts w:hint="eastAsia"/>
+        </w:rPr>
+        <w:t>大概</w:t>
+      </w:r>
+      <w:r>
+        <w:rPr>
+          <w:rFonts w:hint="eastAsia"/>
+        </w:rPr>
+        <w:t>占屏幕的</w:t>
+      </w:r>
+      <w:r>
+        <w:t>6</w:t>
+      </w:r>
+      <w:r>
+        <w:t>%</w:t>
+      </w:r>
+      <w:r>
+        <w:rPr>
+          <w:rFonts w:hint="eastAsia"/>
+        </w:rPr>
+        <w:t>左右</w:t>
+      </w:r>
+      <w:r>
+        <w:rPr>
+          <w:rFonts w:hint="eastAsia"/>
+        </w:rPr>
+        <w:t>（只是大概 不用那么精细）</w:t>
+      </w:r>
+      <w:r>
+        <w:rPr>
+          <w:rFonts w:hint="eastAsia"/>
+        </w:rPr>
+        <w:t>，</w:t>
+      </w:r>
+      <w:r>
+        <w:rPr>
+          <w:rFonts w:hint="eastAsia"/>
+        </w:rPr>
+        <w:t>可以用地块尺寸算，</w:t>
+      </w:r>
+      <w:r>
+        <w:rPr>
+          <w:rFonts w:hint="eastAsia"/>
+        </w:rPr>
+        <w:t>低概率</w:t>
+      </w:r>
+      <w:r>
+        <w:rPr>
+          <w:rFonts w:hint="eastAsia"/>
+        </w:rPr>
+        <w:t>河流组合有更多的水地块</w:t>
+      </w:r>
+      <w:r>
+        <w:rPr>
+          <w:rFonts w:hint="eastAsia"/>
+        </w:rPr>
+        <w:t>。</w:t>
+      </w:r>
+      <w:r>
+        <w:rPr>
+          <w:rFonts w:hint="eastAsia"/>
+        </w:rPr>
+        <w:t>可以有多个水地块组合，一般</w:t>
+      </w:r>
+      <w:r>
+        <w:rPr>
+          <w:rFonts w:hint="eastAsia"/>
+        </w:rPr>
+        <w:t>为</w:t>
+      </w:r>
+      <w:r>
+        <w:t>0~</w:t>
+      </w:r>
+      <w:r>
+        <w:t>2</w:t>
+      </w:r>
+      <w:r>
+        <w:rPr>
+          <w:rFonts w:hint="eastAsia"/>
+        </w:rPr>
+        <w:t>个组合</w:t>
+      </w:r>
+      <w:r>
+        <w:rPr>
+          <w:rFonts w:hint="eastAsia"/>
+        </w:rPr>
+        <w:t>（有可能关卡里没有水）</w:t>
+      </w:r>
+      <w:r>
+        <w:rPr>
+          <w:rFonts w:hint="eastAsia"/>
+        </w:rPr>
+        <w:t xml:space="preserve"> 低概率有更多水</w:t>
+      </w:r>
+      <w:r>
+        <w:rPr>
+          <w:rFonts w:hint="eastAsia"/>
+        </w:rPr>
+        <w:t>组合</w:t>
+      </w:r>
+      <w:r>
+        <w:rPr>
+          <w:rFonts w:hint="eastAsia"/>
+        </w:rPr>
+        <w:t>。</w:t>
+      </w:r>
+    </w:p>
+    <w:p>
+      <w:pPr>
+        <w:rPr>
+          <w:rFonts w:hint="eastAsia"/>
+        </w:rPr>
+      </w:pPr>
+    </w:p>
+    <w:p>
+      <w:pPr>
+        <w:rPr>
+          <w:rFonts w:hint="eastAsia"/>
+        </w:rPr>
+      </w:pPr>
     </w:p>
     <w:p>
       <w:r>
@@ -1296,74 +1592,23 @@
         <w:t>精英怪：</w:t>
       </w:r>
     </w:p>
-    <w:p>
-      <w:pPr>
-        <w:rPr>
-          <w:rFonts w:hint="eastAsia"/>
-        </w:rPr>
-      </w:pPr>
-    </w:p>
     <w:p/>
-    <w:p>
-      <w:r>
-        <w:rPr>
-          <w:rFonts w:hint="eastAsia"/>
-        </w:rPr>
-        <w:t>恶魔球 激光扫射（画线躲）</w:t>
-      </w:r>
-      <w:r>
-        <w:rPr>
-          <w:rFonts w:hint="eastAsia"/>
-        </w:rPr>
-        <w:t xml:space="preserve"> 子弹</w:t>
-      </w:r>
-      <w:proofErr w:type="gramStart"/>
-      <w:r>
-        <w:rPr>
-          <w:rFonts w:hint="eastAsia"/>
-        </w:rPr>
-        <w:t>弹</w:t>
-      </w:r>
-      <w:proofErr w:type="gramEnd"/>
-      <w:r>
-        <w:rPr>
-          <w:rFonts w:hint="eastAsia"/>
-        </w:rPr>
-        <w:t>幕（走位躲）</w:t>
-      </w:r>
-      <w:r>
-        <w:rPr>
-          <w:rFonts w:hint="eastAsia"/>
-        </w:rPr>
-        <w:t>召唤小骷髅（战斗）</w:t>
-      </w:r>
-    </w:p>
-    <w:p>
-      <w:r>
-        <w:rPr>
-          <w:rFonts w:hint="eastAsia"/>
-        </w:rPr>
-        <w:t>恶魔奖励</w:t>
-      </w:r>
-    </w:p>
     <w:p/>
     <w:p>
-      <w:pPr>
-        <w:rPr>
-          <w:rFonts w:hint="eastAsia"/>
-        </w:rPr>
-      </w:pPr>
-      <w:r>
-        <w:rPr>
-          <w:rFonts w:hint="eastAsia"/>
-        </w:rPr>
-        <w:t>地形塌陷</w:t>
-      </w:r>
-      <w:r>
-        <w:rPr>
-          <w:rFonts w:hint="eastAsia"/>
-        </w:rPr>
-        <w:t>：</w:t>
+      <w:r>
+        <w:rPr>
+          <w:rFonts w:hint="eastAsia"/>
+        </w:rPr>
+        <w:t>现在每第</w:t>
+      </w:r>
+      <w:r>
+        <w:t>4</w:t>
+      </w:r>
+      <w:r>
+        <w:rPr>
+          <w:rFonts w:hint="eastAsia"/>
+        </w:rPr>
+        <w:t>关为恶魔关卡/天使关卡：</w:t>
       </w:r>
     </w:p>
     <w:p/>
@@ -1372,86 +1617,400 @@
         <w:rPr>
           <w:rFonts w:hint="eastAsia"/>
         </w:rPr>
-        <w:t>初始装备：</w:t>
-      </w:r>
-    </w:p>
-    <w:p>
-      <w:r>
-        <w:rPr>
-          <w:rFonts w:hint="eastAsia"/>
-        </w:rPr>
-        <w:t>火球远程</w:t>
-      </w:r>
-    </w:p>
-    <w:p>
-      <w:r>
-        <w:rPr>
-          <w:rFonts w:hint="eastAsia"/>
-        </w:rPr>
-        <w:t>炸弹远程</w:t>
-      </w:r>
-    </w:p>
-    <w:p>
-      <w:r>
-        <w:rPr>
-          <w:rFonts w:hint="eastAsia"/>
-        </w:rPr>
-        <w:t>戳戳枪</w:t>
-      </w:r>
-    </w:p>
-    <w:p>
-      <w:pPr>
-        <w:rPr>
-          <w:rFonts w:hint="eastAsia"/>
-        </w:rPr>
-      </w:pPr>
-    </w:p>
-    <w:p>
-      <w:pPr>
-        <w:rPr>
-          <w:rFonts w:hint="eastAsia"/>
-        </w:rPr>
-      </w:pPr>
-    </w:p>
-    <w:p>
-      <w:pPr>
-        <w:rPr>
-          <w:rFonts w:hint="eastAsia"/>
-        </w:rPr>
-      </w:pPr>
-    </w:p>
-    <w:p>
-      <w:r>
-        <w:rPr>
-          <w:rFonts w:hint="eastAsia"/>
-        </w:rPr>
-        <w:t>装备打造：</w:t>
-      </w:r>
-    </w:p>
-    <w:p>
-      <w:pPr>
-        <w:rPr>
-          <w:rFonts w:hint="eastAsia"/>
-        </w:rPr>
-      </w:pPr>
-    </w:p>
-    <w:p>
-      <w:r>
-        <w:rPr>
-          <w:rFonts w:hint="eastAsia"/>
-        </w:rPr>
-        <w:t>宝箱</w:t>
-      </w:r>
-    </w:p>
-    <w:p>
-      <w:r>
-        <w:rPr>
-          <w:rFonts w:hint="eastAsia"/>
-        </w:rPr>
-        <w:t>事件：</w:t>
+        <w:t>敌人的类型和数量还是原来的设计，但是外观和属性上有变化：外观上</w:t>
+      </w:r>
+    </w:p>
+    <w:p>
+      <w:r>
+        <w:rPr>
+          <w:rFonts w:hint="eastAsia"/>
+        </w:rPr>
+        <w:t>恶魔关卡：敌人颜色改为暗红色，身上散发着</w:t>
+      </w:r>
+      <w:r>
+        <w:rPr>
+          <w:rFonts w:hint="eastAsia"/>
+        </w:rPr>
+        <w:t>微弱的</w:t>
+      </w:r>
+      <w:r>
+        <w:rPr>
+          <w:rFonts w:hint="eastAsia"/>
+        </w:rPr>
+        <w:t>黑气，有恐怖的感觉</w:t>
+      </w:r>
+    </w:p>
+    <w:p>
+      <w:r>
+        <w:rPr>
+          <w:rFonts w:hint="eastAsia"/>
+        </w:rPr>
+        <w:t>天使关卡：敌人颜色改为淡黄色，</w:t>
+      </w:r>
+      <w:r>
+        <w:rPr>
+          <w:rFonts w:hint="eastAsia"/>
+        </w:rPr>
+        <w:t>身上散发着</w:t>
+      </w:r>
+      <w:r>
+        <w:rPr>
+          <w:rFonts w:hint="eastAsia"/>
+        </w:rPr>
+        <w:t>微弱的</w:t>
+      </w:r>
+      <w:r>
+        <w:rPr>
+          <w:rFonts w:hint="eastAsia"/>
+        </w:rPr>
+        <w:t>圣光</w:t>
+      </w:r>
+      <w:r>
+        <w:rPr>
+          <w:rFonts w:hint="eastAsia"/>
+        </w:rPr>
+        <w:t>，</w:t>
+      </w:r>
+      <w:r>
+        <w:rPr>
+          <w:rFonts w:hint="eastAsia"/>
+        </w:rPr>
+        <w:t>有神圣的感觉。</w:t>
+      </w:r>
+    </w:p>
+    <w:p>
+      <w:pPr>
+        <w:rPr>
+          <w:rFonts w:hint="eastAsia"/>
+        </w:rPr>
+      </w:pPr>
+      <w:r>
+        <w:rPr>
+          <w:rFonts w:hint="eastAsia"/>
+        </w:rPr>
+        <w:t xml:space="preserve">属性上：恶魔关卡/天使关卡的敌人 </w:t>
+      </w:r>
+      <w:r>
+        <w:rPr>
+          <w:rFonts w:hint="eastAsia"/>
+        </w:rPr>
+        <w:t>移动速度增加1</w:t>
+      </w:r>
+      <w:r>
+        <w:t>5%</w:t>
+      </w:r>
+      <w:r>
+        <w:rPr>
+          <w:rFonts w:hint="eastAsia"/>
+        </w:rPr>
+        <w:t>，防御力增加1</w:t>
+      </w:r>
+      <w:r>
+        <w:t>0%</w:t>
+      </w:r>
+      <w:r>
+        <w:rPr>
+          <w:rFonts w:hint="eastAsia"/>
+        </w:rPr>
+        <w:t>。</w:t>
+      </w:r>
+    </w:p>
+    <w:p>
+      <w:pPr>
+        <w:rPr>
+          <w:rFonts w:hint="eastAsia"/>
+        </w:rPr>
+      </w:pPr>
+    </w:p>
+    <w:p>
+      <w:r>
+        <w:rPr>
+          <w:rFonts w:hint="eastAsia"/>
+        </w:rPr>
+        <w:t>同时恶魔关卡和天使关卡的地图视觉效果也要改变，恶魔关卡和天使关卡地图上没有水地块等特殊地块，</w:t>
+      </w:r>
+      <w:r>
+        <w:rPr>
+          <w:rFonts w:hint="eastAsia"/>
+        </w:rPr>
+        <w:t>也没有树和草等装饰单位。</w:t>
       </w:r>
       <w:bookmarkStart w:id="0" w:name="_GoBack"/>
       <w:bookmarkEnd w:id="0"/>
+      <w:r>
+        <w:rPr>
+          <w:rFonts w:hint="eastAsia"/>
+        </w:rPr>
+        <w:t>只有基础地块。恶魔关卡的基础地块更加的暗黑，有地狱的感觉。天使关卡的地块更加神圣，可以是淡蓝色砖块的感觉。</w:t>
+      </w:r>
+      <w:r>
+        <w:rPr>
+          <w:rFonts w:hint="eastAsia"/>
+        </w:rPr>
+        <w:t>地图正中心可以分别是恶魔和天使的标记</w:t>
+      </w:r>
+      <w:r>
+        <w:rPr>
+          <w:rFonts w:hint="eastAsia"/>
+        </w:rPr>
+        <w:t>绘制</w:t>
+      </w:r>
+      <w:r>
+        <w:rPr>
+          <w:rFonts w:hint="eastAsia"/>
+        </w:rPr>
+        <w:t>。</w:t>
+      </w:r>
+      <w:r>
+        <w:rPr>
+          <w:rFonts w:hint="eastAsia"/>
+        </w:rPr>
+        <w:t>增加仪式感。</w:t>
+      </w:r>
+    </w:p>
+    <w:p>
+      <w:pPr>
+        <w:rPr>
+          <w:rFonts w:hint="eastAsia"/>
+        </w:rPr>
+      </w:pPr>
+    </w:p>
+    <w:p>
+      <w:pPr>
+        <w:rPr>
+          <w:rFonts w:hint="eastAsia"/>
+        </w:rPr>
+      </w:pPr>
+    </w:p>
+    <w:p>
+      <w:pPr>
+        <w:rPr>
+          <w:rFonts w:hint="eastAsia"/>
+        </w:rPr>
+      </w:pPr>
+      <w:r>
+        <w:rPr>
+          <w:rFonts w:hint="eastAsia"/>
+        </w:rPr>
+        <w:t>注意美术像素设计要遵循一贯的像素设计精度，可以参考其他地块等。</w:t>
+      </w:r>
+    </w:p>
+    <w:p>
+      <w:pPr>
+        <w:rPr>
+          <w:rFonts w:hint="eastAsia"/>
+        </w:rPr>
+      </w:pPr>
+    </w:p>
+    <w:p>
+      <w:pPr>
+        <w:rPr>
+          <w:rFonts w:hint="eastAsia"/>
+        </w:rPr>
+      </w:pPr>
+    </w:p>
+    <w:p>
+      <w:r>
+        <w:rPr>
+          <w:rFonts w:hint="eastAsia"/>
+        </w:rPr>
+        <w:t>恶魔球 激光扫射（画线躲）</w:t>
+      </w:r>
+      <w:r>
+        <w:rPr>
+          <w:rFonts w:hint="eastAsia"/>
+        </w:rPr>
+        <w:t xml:space="preserve"> 子弹</w:t>
+      </w:r>
+      <w:proofErr w:type="gramStart"/>
+      <w:r>
+        <w:rPr>
+          <w:rFonts w:hint="eastAsia"/>
+        </w:rPr>
+        <w:t>弹</w:t>
+      </w:r>
+      <w:proofErr w:type="gramEnd"/>
+      <w:r>
+        <w:rPr>
+          <w:rFonts w:hint="eastAsia"/>
+        </w:rPr>
+        <w:t>幕（走位躲）</w:t>
+      </w:r>
+      <w:r>
+        <w:rPr>
+          <w:rFonts w:hint="eastAsia"/>
+        </w:rPr>
+        <w:t>召唤小骷髅（战斗）</w:t>
+      </w:r>
+    </w:p>
+    <w:p>
+      <w:r>
+        <w:rPr>
+          <w:rFonts w:hint="eastAsia"/>
+        </w:rPr>
+        <w:t>恶魔奖励</w:t>
+      </w:r>
+      <w:r>
+        <w:rPr>
+          <w:rFonts w:hint="eastAsia"/>
+        </w:rPr>
+        <w:t>：</w:t>
+      </w:r>
+    </w:p>
+    <w:p>
+      <w:r>
+        <w:rPr>
+          <w:rFonts w:hint="eastAsia"/>
+        </w:rPr>
+        <w:t>死神镰刀：</w:t>
+      </w:r>
+      <w:r>
+        <w:rPr>
+          <w:rFonts w:hint="eastAsia"/>
+        </w:rPr>
+        <w:t>在画线结束位置释放死神镰刀，朝目标方向释放一个</w:t>
+      </w:r>
+      <w:r>
+        <w:rPr>
+          <w:rFonts w:hint="eastAsia"/>
+        </w:rPr>
+        <w:t>无限</w:t>
+      </w:r>
+      <w:r>
+        <w:rPr>
+          <w:rFonts w:hint="eastAsia"/>
+        </w:rPr>
+        <w:t>射程</w:t>
+      </w:r>
+      <w:r>
+        <w:rPr>
+          <w:rFonts w:hint="eastAsia"/>
+        </w:rPr>
+        <w:t>的死神镰刀</w:t>
+      </w:r>
+      <w:r>
+        <w:rPr>
+          <w:rFonts w:hint="eastAsia"/>
+        </w:rPr>
+        <w:t>，死神镰刀有贯通效果。</w:t>
+      </w:r>
+    </w:p>
+    <w:p>
+      <w:pPr>
+        <w:rPr>
+          <w:rFonts w:hint="eastAsia"/>
+        </w:rPr>
+      </w:pPr>
+      <w:r>
+        <w:rPr>
+          <w:rFonts w:hint="eastAsia"/>
+        </w:rPr>
+        <w:t>硫磺火</w:t>
+      </w:r>
+      <w:r>
+        <w:rPr>
+          <w:rFonts w:hint="eastAsia"/>
+        </w:rPr>
+        <w:t>：</w:t>
+      </w:r>
+      <w:r>
+        <w:rPr>
+          <w:rFonts w:hint="eastAsia"/>
+        </w:rPr>
+        <w:t>每</w:t>
+      </w:r>
+      <w:r>
+        <w:t>3秒向目标方向发射无限长度的红色激光，红色激光持续1秒。</w:t>
+      </w:r>
+      <w:r>
+        <w:rPr>
+          <w:rFonts w:hint="eastAsia"/>
+        </w:rPr>
+        <w:t>激光持续期间玩家移动激光也跟着移动，有一种扫射的感觉。</w:t>
+      </w:r>
+    </w:p>
+    <w:p>
+      <w:pPr>
+        <w:rPr>
+          <w:rFonts w:hint="eastAsia"/>
+        </w:rPr>
+      </w:pPr>
+    </w:p>
+    <w:p/>
+    <w:p>
+      <w:r>
+        <w:rPr>
+          <w:rFonts w:hint="eastAsia"/>
+        </w:rPr>
+        <w:t>地形塌陷</w:t>
+      </w:r>
+      <w:r>
+        <w:rPr>
+          <w:rFonts w:hint="eastAsia"/>
+        </w:rPr>
+        <w:t>：</w:t>
+      </w:r>
+    </w:p>
+    <w:p/>
+    <w:p>
+      <w:r>
+        <w:rPr>
+          <w:rFonts w:hint="eastAsia"/>
+        </w:rPr>
+        <w:t>初始装备：</w:t>
+      </w:r>
+    </w:p>
+    <w:p>
+      <w:r>
+        <w:rPr>
+          <w:rFonts w:hint="eastAsia"/>
+        </w:rPr>
+        <w:t>火球远程</w:t>
+      </w:r>
+    </w:p>
+    <w:p>
+      <w:r>
+        <w:rPr>
+          <w:rFonts w:hint="eastAsia"/>
+        </w:rPr>
+        <w:t>炸弹远程</w:t>
+      </w:r>
+    </w:p>
+    <w:p>
+      <w:r>
+        <w:rPr>
+          <w:rFonts w:hint="eastAsia"/>
+        </w:rPr>
+        <w:t>戳戳枪</w:t>
+      </w:r>
+    </w:p>
+    <w:p/>
+    <w:p/>
+    <w:p/>
+    <w:p>
+      <w:r>
+        <w:rPr>
+          <w:rFonts w:hint="eastAsia"/>
+        </w:rPr>
+        <w:t>装备打造：</w:t>
+      </w:r>
+    </w:p>
+    <w:p/>
+    <w:p>
+      <w:r>
+        <w:rPr>
+          <w:rFonts w:hint="eastAsia"/>
+        </w:rPr>
+        <w:t>宝箱</w:t>
+      </w:r>
+    </w:p>
+    <w:p>
+      <w:r>
+        <w:rPr>
+          <w:rFonts w:hint="eastAsia"/>
+        </w:rPr>
+        <w:t>事件：</w:t>
+      </w:r>
     </w:p>
     <w:p>
       <w:r>
@@ -1489,20 +2048,8 @@
         <w:t>精英怪</w:t>
       </w:r>
     </w:p>
-    <w:p>
-      <w:pPr>
-        <w:rPr>
-          <w:rFonts w:hint="eastAsia"/>
-        </w:rPr>
-      </w:pPr>
-    </w:p>
-    <w:p>
-      <w:pPr>
-        <w:rPr>
-          <w:rFonts w:hint="eastAsia"/>
-        </w:rPr>
-      </w:pPr>
-    </w:p>
+    <w:p/>
+    <w:p/>
     <w:sectPr>
       <w:pgSz w:w="11906" w:h="16838"/>
       <w:pgMar w:top="1440" w:right="1800" w:bottom="1440" w:left="1800" w:header="851" w:footer="992" w:gutter="0"/>

</xml_diff>